<commit_message>
docs: reorganizar documentacion por semana y actualizar seccion 3.8 Evidencias
</commit_message>
<xml_diff>
--- a/docs/semana-6/TSY2201_EXP2_S6_Formato_respuesta_Aulafy_Semana6.docx
+++ b/docs/semana-6/TSY2201_EXP2_S6_Formato_respuesta_Aulafy_Semana6.docx
@@ -6479,394 +6479,81 @@
       </w:r>
     </w:p>
     <w:p>
-      <w:pPr>
-        <w:spacing w:after="240"/>
-        <w:jc w:val="both"/>
-        <w:rPr>
-          <w:rFonts w:ascii="Times New Roman" w:eastAsia="Times New Roman" w:hAnsi="Times New Roman" w:cs="Times New Roman"/>
-          <w:color w:val="auto"/>
-          <w:kern w:val="0"/>
-          <w:szCs w:val="24"/>
-          <w:lang w:eastAsia="es-CL"/>
-          <w14:ligatures w14:val="none"/>
-        </w:rPr>
-      </w:pPr>
-      <w:r>
-        <w:rPr>
-          <w:rFonts w:ascii="Times New Roman" w:eastAsia="Times New Roman" w:hAnsi="Times New Roman" w:cs="Times New Roman"/>
-          <w:color w:val="auto"/>
-          <w:kern w:val="0"/>
-          <w:szCs w:val="24"/>
-          <w:lang w:eastAsia="es-CL"/>
-          <w14:ligatures w14:val="none"/>
-        </w:rPr>
-        <w:t xml:space="preserve">Las siguientes capturas </w:t>
-      </w:r>
-      <w:r>
-        <w:rPr>
-          <w:rFonts w:ascii="Times New Roman" w:eastAsia="Times New Roman" w:hAnsi="Times New Roman" w:cs="Times New Roman"/>
-          <w:color w:val="auto"/>
-          <w:kern w:val="0"/>
-          <w:szCs w:val="24"/>
-          <w:lang w:eastAsia="es-CL"/>
-          <w14:ligatures w14:val="none"/>
-        </w:rPr>
-        <w:t>son</w:t>
-      </w:r>
-      <w:r>
-        <w:rPr>
-          <w:rFonts w:ascii="Times New Roman" w:eastAsia="Times New Roman" w:hAnsi="Times New Roman" w:cs="Times New Roman"/>
-          <w:color w:val="auto"/>
-          <w:kern w:val="0"/>
-          <w:szCs w:val="24"/>
-          <w:lang w:eastAsia="es-CL"/>
-          <w14:ligatures w14:val="none"/>
-        </w:rPr>
-        <w:t xml:space="preserve"> evidencia de la entrega de Semana 6:</w:t>
+      <w:pPr/>
+      <w:r>
+        <w:t>Las siguientes capturas respaldan el avance técnico y funcional de la entrega de Semana 6:</w:t>
       </w:r>
     </w:p>
     <w:p>
-      <w:pPr>
-        <w:spacing w:after="240"/>
-        <w:jc w:val="both"/>
-        <w:rPr>
-          <w:rFonts w:ascii="Times New Roman" w:eastAsia="Times New Roman" w:hAnsi="Times New Roman" w:cs="Times New Roman"/>
-          <w:color w:val="auto"/>
-          <w:kern w:val="0"/>
-          <w:szCs w:val="24"/>
-          <w:lang w:eastAsia="es-CL"/>
-          <w14:ligatures w14:val="none"/>
-        </w:rPr>
-      </w:pPr>
-      <w:r>
-        <w:rPr>
-          <w:rFonts w:ascii="Times New Roman" w:eastAsia="Times New Roman" w:hAnsi="Times New Roman" w:cs="Times New Roman"/>
-          <w:color w:val="auto"/>
-          <w:kern w:val="0"/>
-          <w:szCs w:val="24"/>
-          <w:lang w:eastAsia="es-CL"/>
-          <w14:ligatures w14:val="none"/>
-        </w:rPr>
-        <w:t xml:space="preserve">Captura del repositorio GitHub en la rama </w:t>
-      </w:r>
-      <w:proofErr w:type="spellStart"/>
-      <w:r>
-        <w:rPr>
-          <w:rFonts w:ascii="Times New Roman" w:eastAsia="Times New Roman" w:hAnsi="Times New Roman" w:cs="Times New Roman"/>
-          <w:color w:val="auto"/>
-          <w:kern w:val="0"/>
-          <w:szCs w:val="24"/>
-          <w:lang w:eastAsia="es-CL"/>
-          <w14:ligatures w14:val="none"/>
-        </w:rPr>
-        <w:t>develop</w:t>
-      </w:r>
-      <w:proofErr w:type="spellEnd"/>
-      <w:r>
-        <w:rPr>
-          <w:rFonts w:ascii="Times New Roman" w:eastAsia="Times New Roman" w:hAnsi="Times New Roman" w:cs="Times New Roman"/>
-          <w:color w:val="auto"/>
-          <w:kern w:val="0"/>
-          <w:szCs w:val="24"/>
-          <w:lang w:eastAsia="es-CL"/>
-          <w14:ligatures w14:val="none"/>
-        </w:rPr>
-        <w:t xml:space="preserve"> mostrando el código fuente actualizado y los </w:t>
-      </w:r>
-      <w:proofErr w:type="spellStart"/>
-      <w:r>
-        <w:rPr>
-          <w:rFonts w:ascii="Times New Roman" w:eastAsia="Times New Roman" w:hAnsi="Times New Roman" w:cs="Times New Roman"/>
-          <w:color w:val="auto"/>
-          <w:kern w:val="0"/>
-          <w:szCs w:val="24"/>
-          <w:lang w:eastAsia="es-CL"/>
-          <w14:ligatures w14:val="none"/>
-        </w:rPr>
-        <w:t>commits</w:t>
-      </w:r>
-      <w:proofErr w:type="spellEnd"/>
-      <w:r>
-        <w:rPr>
-          <w:rFonts w:ascii="Times New Roman" w:eastAsia="Times New Roman" w:hAnsi="Times New Roman" w:cs="Times New Roman"/>
-          <w:color w:val="auto"/>
-          <w:kern w:val="0"/>
-          <w:szCs w:val="24"/>
-          <w:lang w:eastAsia="es-CL"/>
-          <w14:ligatures w14:val="none"/>
-        </w:rPr>
-        <w:t xml:space="preserve"> de avance.</w:t>
+      <w:pPr/>
+      <w:r>
+        <w:t>1_GitHub_rama_develop_semana6.png: evidencia del repositorio GitHub en la rama develop, con el código fuente actualizado y commits de avance.</w:t>
       </w:r>
     </w:p>
     <w:p>
-      <w:pPr>
-        <w:spacing w:after="240"/>
-        <w:jc w:val="both"/>
-        <w:rPr>
-          <w:rFonts w:ascii="Times New Roman" w:eastAsia="Times New Roman" w:hAnsi="Times New Roman" w:cs="Times New Roman"/>
-          <w:color w:val="auto"/>
-          <w:kern w:val="0"/>
-          <w:szCs w:val="24"/>
-          <w:lang w:eastAsia="es-CL"/>
-          <w14:ligatures w14:val="none"/>
-        </w:rPr>
-      </w:pPr>
-      <w:r>
-        <w:rPr>
-          <w:rFonts w:ascii="Times New Roman" w:eastAsia="Times New Roman" w:hAnsi="Times New Roman" w:cs="Times New Roman"/>
-          <w:color w:val="auto"/>
-          <w:kern w:val="0"/>
-          <w:szCs w:val="24"/>
-          <w:lang w:eastAsia="es-CL"/>
-          <w14:ligatures w14:val="none"/>
-        </w:rPr>
-        <w:t>Captura del frontend AWS abierto en el navegador, idealmente en la pantalla de inicio de sesión.</w:t>
+      <w:pPr/>
+      <w:r>
+        <w:t>2_Frontend_AWS_login.png: evidencia del frontend desplegado en AWS S3 Static Website, mostrando la pantalla de inicio de sesión.</w:t>
       </w:r>
     </w:p>
     <w:p>
-      <w:pPr>
-        <w:spacing w:after="240"/>
-        <w:jc w:val="both"/>
-        <w:rPr>
-          <w:rFonts w:ascii="Times New Roman" w:eastAsia="Times New Roman" w:hAnsi="Times New Roman" w:cs="Times New Roman"/>
-          <w:color w:val="auto"/>
-          <w:kern w:val="0"/>
-          <w:szCs w:val="24"/>
-          <w:lang w:eastAsia="es-CL"/>
-          <w14:ligatures w14:val="none"/>
-        </w:rPr>
-      </w:pPr>
-      <w:r>
-        <w:rPr>
-          <w:rFonts w:ascii="Times New Roman" w:eastAsia="Times New Roman" w:hAnsi="Times New Roman" w:cs="Times New Roman"/>
-          <w:color w:val="auto"/>
-          <w:kern w:val="0"/>
-          <w:szCs w:val="24"/>
-          <w:lang w:eastAsia="es-CL"/>
-          <w14:ligatures w14:val="none"/>
-        </w:rPr>
-        <w:t>Captura del inicio de sesión funcionando con un usuario demo.</w:t>
+      <w:pPr/>
+      <w:r>
+        <w:t>3_Login_ADMIN_funcionando.png: evidencia del inicio de sesión exitoso con usuario demo ADMIN.</w:t>
       </w:r>
     </w:p>
     <w:p>
-      <w:pPr>
-        <w:spacing w:after="240"/>
-        <w:jc w:val="both"/>
-        <w:rPr>
-          <w:rFonts w:ascii="Times New Roman" w:eastAsia="Times New Roman" w:hAnsi="Times New Roman" w:cs="Times New Roman"/>
-          <w:color w:val="auto"/>
-          <w:kern w:val="0"/>
-          <w:szCs w:val="24"/>
-          <w:lang w:eastAsia="es-CL"/>
-          <w14:ligatures w14:val="none"/>
-        </w:rPr>
-      </w:pPr>
-      <w:r>
-        <w:rPr>
-          <w:rFonts w:ascii="Times New Roman" w:eastAsia="Times New Roman" w:hAnsi="Times New Roman" w:cs="Times New Roman"/>
-          <w:color w:val="auto"/>
-          <w:kern w:val="0"/>
-          <w:szCs w:val="24"/>
-          <w:lang w:eastAsia="es-CL"/>
-          <w14:ligatures w14:val="none"/>
-        </w:rPr>
-        <w:t xml:space="preserve">Captura del </w:t>
-      </w:r>
-      <w:proofErr w:type="spellStart"/>
-      <w:r>
-        <w:rPr>
-          <w:rFonts w:ascii="Times New Roman" w:eastAsia="Times New Roman" w:hAnsi="Times New Roman" w:cs="Times New Roman"/>
-          <w:color w:val="auto"/>
-          <w:kern w:val="0"/>
-          <w:szCs w:val="24"/>
-          <w:lang w:eastAsia="es-CL"/>
-          <w14:ligatures w14:val="none"/>
-        </w:rPr>
-        <w:t>endpoint</w:t>
-      </w:r>
-      <w:proofErr w:type="spellEnd"/>
-      <w:r>
-        <w:rPr>
-          <w:rFonts w:ascii="Times New Roman" w:eastAsia="Times New Roman" w:hAnsi="Times New Roman" w:cs="Times New Roman"/>
-          <w:color w:val="auto"/>
-          <w:kern w:val="0"/>
-          <w:szCs w:val="24"/>
-          <w:lang w:eastAsia="es-CL"/>
-          <w14:ligatures w14:val="none"/>
-        </w:rPr>
-        <w:t xml:space="preserve"> /api/</w:t>
-      </w:r>
-      <w:proofErr w:type="spellStart"/>
-      <w:r>
-        <w:rPr>
-          <w:rFonts w:ascii="Times New Roman" w:eastAsia="Times New Roman" w:hAnsi="Times New Roman" w:cs="Times New Roman"/>
-          <w:color w:val="auto"/>
-          <w:kern w:val="0"/>
-          <w:szCs w:val="24"/>
-          <w:lang w:eastAsia="es-CL"/>
-          <w14:ligatures w14:val="none"/>
-        </w:rPr>
-        <w:t>health</w:t>
-      </w:r>
-      <w:proofErr w:type="spellEnd"/>
-      <w:r>
-        <w:rPr>
-          <w:rFonts w:ascii="Times New Roman" w:eastAsia="Times New Roman" w:hAnsi="Times New Roman" w:cs="Times New Roman"/>
-          <w:color w:val="auto"/>
-          <w:kern w:val="0"/>
-          <w:szCs w:val="24"/>
-          <w:lang w:eastAsia="es-CL"/>
-          <w14:ligatures w14:val="none"/>
-        </w:rPr>
-        <w:t xml:space="preserve"> del backend respondiendo correctamente.</w:t>
+      <w:pPr/>
+      <w:r>
+        <w:t>4_Backend_AWS_health.png: evidencia del endpoint /api/health del backend desplegado en AWS Elastic Beanstalk respondiendo correctamente.</w:t>
       </w:r>
     </w:p>
     <w:p>
-      <w:pPr>
-        <w:spacing w:after="240"/>
-        <w:jc w:val="both"/>
-        <w:rPr>
-          <w:rFonts w:ascii="Times New Roman" w:eastAsia="Times New Roman" w:hAnsi="Times New Roman" w:cs="Times New Roman"/>
-          <w:color w:val="auto"/>
-          <w:kern w:val="0"/>
-          <w:szCs w:val="24"/>
-          <w:lang w:eastAsia="es-CL"/>
-          <w14:ligatures w14:val="none"/>
-        </w:rPr>
-      </w:pPr>
-      <w:r>
-        <w:rPr>
-          <w:rFonts w:ascii="Times New Roman" w:eastAsia="Times New Roman" w:hAnsi="Times New Roman" w:cs="Times New Roman"/>
-          <w:color w:val="auto"/>
-          <w:kern w:val="0"/>
-          <w:szCs w:val="24"/>
-          <w:lang w:eastAsia="es-CL"/>
-          <w14:ligatures w14:val="none"/>
-        </w:rPr>
-        <w:t xml:space="preserve">Captura opcional del resultado de </w:t>
-      </w:r>
-      <w:proofErr w:type="spellStart"/>
-      <w:r>
-        <w:rPr>
-          <w:rFonts w:ascii="Times New Roman" w:eastAsia="Times New Roman" w:hAnsi="Times New Roman" w:cs="Times New Roman"/>
-          <w:color w:val="auto"/>
-          <w:kern w:val="0"/>
-          <w:szCs w:val="24"/>
-          <w:lang w:eastAsia="es-CL"/>
-          <w14:ligatures w14:val="none"/>
-        </w:rPr>
-        <w:t>npm</w:t>
-      </w:r>
-      <w:proofErr w:type="spellEnd"/>
-      <w:r>
-        <w:rPr>
-          <w:rFonts w:ascii="Times New Roman" w:eastAsia="Times New Roman" w:hAnsi="Times New Roman" w:cs="Times New Roman"/>
-          <w:color w:val="auto"/>
-          <w:kern w:val="0"/>
-          <w:szCs w:val="24"/>
-          <w:lang w:eastAsia="es-CL"/>
-          <w14:ligatures w14:val="none"/>
-        </w:rPr>
-        <w:t xml:space="preserve"> run </w:t>
-      </w:r>
-      <w:proofErr w:type="spellStart"/>
-      <w:proofErr w:type="gramStart"/>
-      <w:r>
-        <w:rPr>
-          <w:rFonts w:ascii="Times New Roman" w:eastAsia="Times New Roman" w:hAnsi="Times New Roman" w:cs="Times New Roman"/>
-          <w:color w:val="auto"/>
-          <w:kern w:val="0"/>
-          <w:szCs w:val="24"/>
-          <w:lang w:eastAsia="es-CL"/>
-          <w14:ligatures w14:val="none"/>
-        </w:rPr>
-        <w:t>test:coverage</w:t>
-      </w:r>
-      <w:proofErr w:type="spellEnd"/>
-      <w:proofErr w:type="gramEnd"/>
-      <w:r>
-        <w:rPr>
-          <w:rFonts w:ascii="Times New Roman" w:eastAsia="Times New Roman" w:hAnsi="Times New Roman" w:cs="Times New Roman"/>
-          <w:color w:val="auto"/>
-          <w:kern w:val="0"/>
-          <w:szCs w:val="24"/>
-          <w:lang w:eastAsia="es-CL"/>
-          <w14:ligatures w14:val="none"/>
-        </w:rPr>
-        <w:t>, mostrando la ejecución correcta de pruebas y la línea base de cobertura.</w:t>
+      <w:pPr/>
+      <w:r>
+        <w:t>5_Cobertura_tests_backend.png: evidencia de la ejecución de pruebas backend y línea base de cobertura.</w:t>
       </w:r>
     </w:p>
     <w:p>
-      <w:pPr>
-        <w:spacing w:after="240"/>
-        <w:jc w:val="both"/>
-        <w:rPr>
-          <w:rFonts w:ascii="Times New Roman" w:eastAsia="Times New Roman" w:hAnsi="Times New Roman" w:cs="Times New Roman"/>
-          <w:color w:val="auto"/>
-          <w:kern w:val="0"/>
-          <w:szCs w:val="24"/>
-          <w:lang w:eastAsia="es-CL"/>
-          <w14:ligatures w14:val="none"/>
-        </w:rPr>
-      </w:pPr>
-      <w:r>
-        <w:rPr>
-          <w:rFonts w:ascii="Times New Roman" w:eastAsia="Times New Roman" w:hAnsi="Times New Roman" w:cs="Times New Roman"/>
-          <w:color w:val="auto"/>
-          <w:kern w:val="0"/>
-          <w:szCs w:val="24"/>
-          <w:lang w:eastAsia="es-CL"/>
-          <w14:ligatures w14:val="none"/>
-        </w:rPr>
-        <w:t xml:space="preserve">Captura opcional del resultado de </w:t>
-      </w:r>
-      <w:proofErr w:type="spellStart"/>
-      <w:r>
-        <w:rPr>
-          <w:rFonts w:ascii="Times New Roman" w:eastAsia="Times New Roman" w:hAnsi="Times New Roman" w:cs="Times New Roman"/>
-          <w:color w:val="auto"/>
-          <w:kern w:val="0"/>
-          <w:szCs w:val="24"/>
-          <w:lang w:eastAsia="es-CL"/>
-          <w14:ligatures w14:val="none"/>
-        </w:rPr>
-        <w:t>npm</w:t>
-      </w:r>
-      <w:proofErr w:type="spellEnd"/>
-      <w:r>
-        <w:rPr>
-          <w:rFonts w:ascii="Times New Roman" w:eastAsia="Times New Roman" w:hAnsi="Times New Roman" w:cs="Times New Roman"/>
-          <w:color w:val="auto"/>
-          <w:kern w:val="0"/>
-          <w:szCs w:val="24"/>
-          <w:lang w:eastAsia="es-CL"/>
-          <w14:ligatures w14:val="none"/>
-        </w:rPr>
-        <w:t xml:space="preserve"> run </w:t>
-      </w:r>
-      <w:proofErr w:type="spellStart"/>
-      <w:r>
-        <w:rPr>
-          <w:rFonts w:ascii="Times New Roman" w:eastAsia="Times New Roman" w:hAnsi="Times New Roman" w:cs="Times New Roman"/>
-          <w:color w:val="auto"/>
-          <w:kern w:val="0"/>
-          <w:szCs w:val="24"/>
-          <w:lang w:eastAsia="es-CL"/>
-          <w14:ligatures w14:val="none"/>
-        </w:rPr>
-        <w:t>build</w:t>
-      </w:r>
-      <w:proofErr w:type="spellEnd"/>
-      <w:r>
-        <w:rPr>
-          <w:rFonts w:ascii="Times New Roman" w:eastAsia="Times New Roman" w:hAnsi="Times New Roman" w:cs="Times New Roman"/>
-          <w:color w:val="auto"/>
-          <w:kern w:val="0"/>
-          <w:szCs w:val="24"/>
-          <w:lang w:eastAsia="es-CL"/>
-          <w14:ligatures w14:val="none"/>
-        </w:rPr>
-        <w:t xml:space="preserve"> del frontend, mostrando que la aplicación Angular compila correctamente.</w:t>
+      <w:pPr/>
+      <w:r>
+        <w:t>6_Build_frontend_OK.png: evidencia de compilación correcta del frontend Angular.</w:t>
+      </w:r>
+    </w:p>
+    <w:p>
+      <w:pPr/>
+      <w:r>
+        <w:t>7_Menu_PROFESOR_mensajes_del_curso.png: evidencia del menú del rol PROFESOR con acceso a "Mensajes del curso".</w:t>
+      </w:r>
+    </w:p>
+    <w:p>
+      <w:pPr/>
+      <w:r>
+        <w:t>8_Menu_COLEGIO.png: evidencia del menú y navegación disponible para el rol COLEGIO.</w:t>
+      </w:r>
+    </w:p>
+    <w:p>
+      <w:pPr/>
+      <w:r>
+        <w:t>9_Chat_APODERADO_visible.png: evidencia de disponibilidad del módulo de chat o mensajes para el rol APODERADO.</w:t>
+      </w:r>
+    </w:p>
+    <w:p>
+      <w:pPr/>
+      <w:r>
+        <w:t>10_Reportes_riesgo_ADMIN.png: evidencia del módulo de reportes y riesgo académico disponible para el rol ADMIN.</w:t>
+      </w:r>
+    </w:p>
+    <w:p>
+      <w:pPr/>
+      <w:r>
+        <w:t>11_Dashboard_PROFESOR_sin_modulo_riesgo.png: evidencia de que el rol PROFESOR no tiene acceso visible al módulo de riesgo académico.</w:t>
+      </w:r>
+    </w:p>
+    <w:p>
+      <w:pPr/>
+      <w:r>
+        <w:t>12_Codigo_role_in_course_profesor_jefe.png: evidencia técnica de la incorporación del campo role_in_course en course_teachers para formalizar la diferenciación de profesor jefe, profesor de asignatura y asistente docente.</w:t>
       </w:r>
     </w:p>
     <w:p>

</xml_diff>